<commit_message>
Report the AI panel as two judges throughout
Every judge number in the thesis comes from Nemotron 3 Ultra and
gpt-oss-120b, which scored all 512 replies. The panel is now described as
two judges in 4.1.5.1, 5.3.7, 5.6.6, the tools section, the project log and
the risk section, and the two-vs-three-judge robustness rows are removed
from ai_judge_agreement.csv, the panel table and the selection criteria.

Co-Authored-By: Claude Opus 5 (1M context) <noreply@anthropic.com>
</commit_message>
<xml_diff>
--- a/writing/Chapter 3 - 3.4 Ethical Issues/WRITING_GUIDE.docx
+++ b/writing/Chapter 3 - 3.4 Ethical Issues/WRITING_GUIDE.docx
@@ -298,7 +298,7 @@
     </w:p>
     <w:p>
       <w:r>
-        <w:t>All experiments use the public EmpatheticDialogues corpus; no personal data was collected to build or tune the models. During evaluation, only ED conversation text and the corresponding generated replies were sent to third-party AI-judge APIs (OpenRouter, Mistral, Groq). No user data was involved. Both models run on local hardware, so a deployed instance does not need to send a user's disclosure to an external provider. This is one practical motivation for a small, self-hostable pipeline. The prepared demonstration interface (not yet publicly deployed) holds conversation history only in per-session memory on the server and writes nothing to disk or logs; closing the page discards it.</w:t>
+        <w:t>All experiments use the public EmpatheticDialogues corpus; no personal data was collected to build or tune the models. During evaluation, only ED conversation text and the corresponding generated replies were sent to third-party AI-judge APIs (OpenRouter, Groq). No user data was involved. Both models run on local hardware, so a deployed instance does not need to send a user's disclosure to an external provider. This is one practical motivation for a small, self-hostable pipeline. The prepared demonstration interface (not yet publicly deployed) holds conversation history only in per-session memory on the server and writes nothing to disk or logs; closing the page discards it.</w:t>
       </w:r>
     </w:p>
     <w:p>
@@ -1037,7 +1037,7 @@
               <w:rPr>
                 <w:sz w:val="16"/>
               </w:rPr>
-              <w:t>NVIDIA Nemotron 3 Ultra, Mistral Large</w:t>
+              <w:t>NVIDIA Nemotron 3 Ultra, gpt-oss-120b (Groq)</w:t>
             </w:r>
           </w:p>
         </w:tc>

</xml_diff>